<commit_message>
Encurtar Áreas de Impacto Andressa para limite 3000 caracteres
Co-authored-by: Jonatas Andrade <jonatasandradedeveloper@users.noreply.github.com>
</commit_message>
<xml_diff>
--- a/DOCS-PEOPLE-LEAD/Andressa-Silva/10-Areas-de-Impacto.docx
+++ b/DOCS-PEOPLE-LEAD/Andressa-Silva/10-Areas-de-Impacto.docx
@@ -12,7 +12,7 @@
           <w:color w:val="1F3A5F"/>
           <w:sz w:val="40"/>
         </w:rPr>
-        <w:t>Andressa Silva — ÁREAS DE IMPACTO (colar no Workday)</w:t>
+        <w:t>Andressa Silva — ÁREAS DE IMPACTO (melhorado)</w:t>
       </w:r>
     </w:p>
     <w:p>
@@ -22,7 +22,7 @@
           <w:color w:val="555555"/>
           <w:sz w:val="22"/>
         </w:rPr>
-        <w:t>Áreas de Impacto melhoradas · Andressa</w:t>
+        <w:t>Áreas de Impacto ≤3000 · Andressa</w:t>
       </w:r>
     </w:p>
     <w:p/>
@@ -36,22 +36,24 @@
     </w:p>
     <w:p>
       <w:r>
-        <w:t xml:space="preserve">Nome: </w:t>
-      </w:r>
-      <w:r>
         <w:rPr>
           <w:b/>
         </w:rPr>
         <w:t>Andressa Silva Pereira</w:t>
       </w:r>
       <w:r>
-        <w:t xml:space="preserve"> · Analyst, Back-End · </w:t>
+        <w:t xml:space="preserve"> · Analyst, Back-End Developer · </w:t>
       </w:r>
       <w:r>
         <w:rPr>
           <w:b/>
         </w:rPr>
         <w:t>MAPFRE</w:t>
+      </w:r>
+    </w:p>
+    <w:p>
+      <w:r>
+        <w:t>Base: 1:1 (28/07) · histórico Pix/.NET · SC-900/DP-900 · Women In Tech · Power Skills · feedbacks Camila, Renata e Rafael G. Martins.</w:t>
       </w:r>
     </w:p>
     <w:p>
@@ -66,7 +68,7 @@
         <w:pStyle w:val="Heading1"/>
       </w:pPr>
       <w:r>
-        <w:t>COPIAR — Português (4 áreas)</w:t>
+        <w:t>COPIAR — Português</w:t>
       </w:r>
     </w:p>
     <w:p>
@@ -79,7 +81,7 @@
     </w:p>
     <w:p>
       <w:r>
-        <w:t>Andressa Silva Pereira atuou no cliente MAPFRE em frente de sustentação de menor porte, contribuindo nas atividades do time e ampliando conhecimento sobre o projeto e suas tecnologias. A par Renata destaca domínio de C# e SQL e referência nas análises do dia a dia. O gestor Rafael G. Martins reconhece a contribuição e o potencial, porém aponta que a evolução técnica no período ficou abaixo do esperado, com dependência ainda significativa do apoio da liderança técnica. Para o próximo ciclo, o impacto no cliente deve crescer via maior autonomia na condução e conclusão das demandas e fortalecimento técnico em .NET aplicado à frente.</w:t>
+        <w:t>Andressa Silva Pereira atuou no cliente MAPFRE (desde out/2025) em sustentação de sistemas legados (.NET Framework, TFS, SOAP), com foco em análise de incidentes apontados pelo parceiro, diagnóstico e restabelecimento do serviço em time pequeno (Avanade + cliente). A par Renata Pereira Da Silva destaca domínio de C# e SQL e papel de referência nas análises do dia a dia, evidenciando valor técnico operacional. O gestor Rafael G. Martins reconhece contribuição e potencial, porém avalia que a evolução técnica no período ficou abaixo do esperado e que ainda há dependência significativa do apoio da liderança técnica para conduzir e concluir demandas. O People Lead contextualiza: o ciclo ocorreu em frente de menor porte e stack aquém do histórico dela (Pix/microsserviços/.NET Core até 2024), o que limita visibilidade de impacto — sem isentar o plano de acelerar autonomia. Próximo ciclo (Review in 12 months): maior independência na análise/resolução de problemas e .NET aplicado às tecnologias da frente, para elevar o valor percebido no cliente.</w:t>
       </w:r>
     </w:p>
     <w:p>
@@ -92,7 +94,7 @@
     </w:p>
     <w:p>
       <w:r>
-        <w:t>Andressa manteve intenção alinhada à habilitação de IA da prática, com estudo e tentativas na trilha AI-900, além de certificações já conquistadas (SC-900 e DP-900). No dia a dia da MAPFRE (stack legado / sustentação), a aplicação prática de IA/Copilot no projeto ainda é limitada. A prioridade de badge AI-900 permanece condicionada a evolução de inglês e a um plano realista no próximo ciclo; o foco imediato de impacto deve priorizar autonomia técnica no cliente, conectando capacitação à entrega.</w:t>
+        <w:t>Andressa manteve compromisso com a agenda de IA da prática: estudo contínuo ao longo do FY, múltiplas tentativas de AI-900/AZ-900 e base já conquistada em SC-900 e DP-900. O bloqueio principal da AI-900 é a prova em inglês (formato cronometrado), não ausência de esforço — tema alinhado nas 1:1 com o People Lead, com plano de escada (inglês/goFluent + próxima certificação realista, ex. foundations GitHub/Azure) no próximo ciclo. No dia a dia da MAPFRE, o ambiente legado limita o uso agentico/moderno de IA; ainda assim, a orientação é ampliar aplicação prática (ex.: Copilot na análise de código/incidentes) e registrar skill no mini CV. Impacto deste FY: capacitação e trilha em andamento, com honestidade de que o badge AI-900 ainda não foi obtido; próximo ciclo deve conectar aprendizado de IA à entrega no cliente e à autonomia técnica pedida pelo gestor.</w:t>
       </w:r>
     </w:p>
     <w:p>
@@ -105,7 +107,7 @@
     </w:p>
     <w:p>
       <w:r>
-        <w:t>Andressa contribui para um ambiente colaborativo: compartilha descobertas com o time (Renata), participa com consistência da trilha Women In Tech / Power Skills (Camila) e mantém abertura nas 1:1 de carreira com o People Lead. Demonstra busca por aprendizado e atualização. O próximo ciclo deve equilibrar essa postura de colaboração com maior independência na execução técnica no projeto, transformando o suporte da liderança em autonomia.</w:t>
+        <w:t>Andressa contribui para um ambiente colaborativo e de aprendizado: compartilha descobertas e discussões técnicas com o time (Renata), comunica-se de forma clara com pares/gestor, participa de Power Skills e mantém 1:1s abertas com o People Lead sobre carreira, frustração com stack e expectativas — postura madura de reinventora sob restrição de alocação. Demonstra comprometimento e busca constante por atualização, mesmo após tentativas frustradas de certificação. O equilíbrio pedido para o próximo ciclo é transformar essa colaboração e o suporte da liderança técnica em maior autonomia na execução, sem perder a qualidade de interação que o time reconhece.</w:t>
       </w:r>
     </w:p>
     <w:p>
@@ -118,7 +120,7 @@
     </w:p>
     <w:p>
       <w:r>
-        <w:t xml:space="preserve">Andressa teve impacto concreto em comunidade via </w:t>
+        <w:t xml:space="preserve">Andressa entregou impacto concreto em comunidade via </w:t>
       </w:r>
       <w:r>
         <w:rPr>
@@ -127,7 +129,7 @@
         <w:t>Women In Tech</w:t>
       </w:r>
       <w:r>
-        <w:t>: Camila Ferreira Ribeiro registra comprometimento com a trilha Power Skills, participação em todas as sessões analisadas, presença consistente, elevada aderência ao programa e interações que reforçam o ambiente colaborativo dos encontros. Essa frente é um ponto forte do FY e deve ser mantida no próximo ciclo, sem substituir a necessidade de acelerar autonomia técnica no cliente.</w:t>
+        <w:t>: Camila Ferreira Ribeiro confirma comprometimento com a trilha Power Skills Women in Tech, participação em todas as sessões analisadas, presença consistente, elevada aderência ao programa e interações na plataforma que reforçam o ambiente colaborativo. Na 1:1, ela também descreveu atuação de voluntariado no onboarding de novas participantes. Essa frente é um dos resultados mais sólidos e evidentes do FY26 e deve ser mantida; no fechamento, complementa (não substitui) a necessidade de acelerar autonomia e evolução técnica no cliente MAPFRE.</w:t>
       </w:r>
     </w:p>
     <w:p>
@@ -142,7 +144,7 @@
         <w:pStyle w:val="Heading1"/>
       </w:pPr>
       <w:r>
-        <w:t>COPIAR — English (se o campo estiver em inglês)</w:t>
+        <w:t>COPIAR — English</w:t>
       </w:r>
     </w:p>
     <w:p>
@@ -155,7 +157,7 @@
     </w:p>
     <w:p>
       <w:r>
-        <w:t>Andressa Silva Pereira contributed at MAPFRE on a smaller sustainment stream, supporting team activities and building project/technology knowledge. Peer Renata highlights strong C# and SQL skills and day-to-day analysis reference. Manager Rafael G. Martins recognizes contribution and growth potential, while noting technical progress below expectations and continued dependence on technical leadership support. Next cycle impact should come from greater autonomy closing work and applied .NET strength on her stream.</w:t>
+        <w:t>Andressa Silva Pereira supported MAPFRE (since Oct/2025) on legacy sustainment (.NET Framework, TFS, SOAP), focusing on partner-reported incident analysis, diagnosis, and service recovery in a small mixed team. Peer Renata highlights strong C# and SQL and day-to-day analysis reference. Manager Rafael G. Martins recognizes contribution and potential, while assessing technical evolution below expectations and significant dependence on technical leadership to drive work to completion. People Lead context: the FY was spent on a smaller stream with stack below her prior Pix/microservices/.NET Core track—limiting visibility—while still requiring a clear autonomy acceleration plan. Next cycle (Review in 12 months): more independent problem-solving and applied .NET on her stream to raise client-perceived value.</w:t>
       </w:r>
     </w:p>
     <w:p>
@@ -168,7 +170,7 @@
     </w:p>
     <w:p>
       <w:r>
-        <w:t>Andressa stayed aligned with AI enablement intent through AI-900 study/attempts and prior SC-900/DP-900 certifications. Practical AI/Copilot application in the MAPFRE legacy/sustainment context remained limited this FY. Formal AI-900 depends on English progress and a realistic next-cycle plan; near-term impact should prioritize client technical autonomy while connecting learning to delivery.</w:t>
+        <w:t>Andressa stayed committed to AI enablement through continuous study, multiple AI-900/AZ-900 attempts, and earned SC-900 and DP-900. The main AI-900 blocker is English timed exams, not lack of effort—aligned in People Lead 1:1s with a realistic ladder (English/goFluent + next certification). MAPFRE legacy work limits modern AI application; next step is practical Copilot use in analysis and mini-CV skill visibility. This FY impact is learning trajectory with honest incomplete AI-900 badge; next cycle should connect AI learning to client delivery and the autonomy her manager requires.</w:t>
       </w:r>
     </w:p>
     <w:p>
@@ -181,7 +183,7 @@
     </w:p>
     <w:p>
       <w:r>
-        <w:t>Andressa contributes to a collaborative environment: shares knowledge with the team (Renata), consistently engages in Women In Tech / Power Skills (Camila), and stays open in career 1:1s with her People Lead. Next cycle should balance this collaborative strength with greater technical independence on project execution.</w:t>
+        <w:t>Andressa strengthens a collaborative learning environment: shares technical insights with the team (Renata), communicates clearly, attends Power Skills, and engages openly in career 1:1s about allocation constraints and growth. She persists in upskilling despite certification setbacks. Next cycle should convert collaboration and leadership support into greater execution autonomy while keeping the peer-recognized team contribution.</w:t>
       </w:r>
     </w:p>
     <w:p>
@@ -194,7 +196,7 @@
     </w:p>
     <w:p>
       <w:r>
-        <w:t>Clear community impact via Women In Tech: Camila Ferreira Ribeiro confirms commitment to the Power Skills track, attendance at all reviewed sessions, consistent presence, high program adherence, and platform interactions that support a collaborative learning environment. Keep this strength next cycle without substituting the need to accelerate technical autonomy on the client.</w:t>
+        <w:t>Clear community impact via Women In Tech: Camila Ferreira Ribeiro confirms Power Skills WIT commitment, attendance at all reviewed sessions, consistent presence, high adherence, and platform interactions that support collaboration. She also described onboarding support for new participants. This is one of the strongest evidenced FY26 outcomes and should continue—complementing, not replacing, MAPFRE technical autonomy goals.</w:t>
       </w:r>
     </w:p>
     <w:p>
@@ -209,12 +211,12 @@
         <w:pStyle w:val="Heading1"/>
       </w:pPr>
       <w:r>
-        <w:t>Se o Workday tiver UM único campo “Areas of Impact”</w:t>
+        <w:t>Bloco único (se houver só um campo)</w:t>
       </w:r>
     </w:p>
     <w:p>
       <w:r>
-        <w:t>Areas of Impact — People Lead summary: (1) Client Value Creation — MAPFRE sustainment contribution; peer recognizes C#/SQL analysis strength; manager notes technical evolution below expectations and dependence on tech leadership—next cycle: autonomy and applied .NET. (2) AI Enablement — AI-900 intent/study; SC-900/DP-900 already earned; limited practical AI on legacy stream; formal AI-900 next cycle with English plan. (3) Great Place to Work — collaborative, knowledge sharing, strong WIT engagement; increase independent execution. (4) Community — strong Women In Tech evidence (Camila): full session attendance and consistent participation.</w:t>
+        <w:t>Areas of Impact — PL: (1) Client — MAPFRE legacy sustainment; Renata: C#/SQL analysis reference; Rafael: below-expected technical evolution + tech-lead dependence; next: autonomy + applied .NET (Review 12 months). Context: prior Pix/.NET Core track vs current legacy stream. (2) AI — SC-900/DP-900 earned; AI-900 attempts blocked mainly by English; limited Copilot on legacy; next: practical AI + certification ladder. (3) GPTW — collaborative knowledge sharing, Power Skills, open career 1:1s; convert support into autonomy. (4) Community — strong Women In Tech evidence (Camila): full session attendance, consistent engagement, onboarding support.</w:t>
       </w:r>
     </w:p>
     <w:sectPr>

</xml_diff>